<commit_message>
Add README and update user guide
- README.md: full GitHub page with feature overview, colour meaning
  presets table, export format table, Mac and Windows setup instructions,
  usage guide, and dependencies table
- How to use Pdf-Mithra.docx: rewritten to cover both platforms,
  all 6 export formats, section detection, colour meanings, and
  correct setup steps for Mac (keep outside Desktop/Documents) and
  Windows (Pdf-Mithra.bat auto-setup)

Co-Authored-By: Claude Sonnet 4.6 <noreply@anthropic.com>
</commit_message>
<xml_diff>
--- a/How to use Pdf-Mithra.docx
+++ b/How to use Pdf-Mithra.docx
@@ -20,7 +20,13 @@
     </w:p>
     <w:p>
       <w:r>
-        <w:t>Named after Sangha Mithra — "Mithra" means friend, and Pdf-Mithra is your friend of PDFs.</w:t>
+        <w:rPr>
+          <w:i/>
+        </w:rPr>
+        <w:t>Named after Sangha Mithra</w:t>
+      </w:r>
+      <w:r>
+        <w:t xml:space="preserve"> — Mithra means friend, and Pdf-Mithra is your friend of PDFs.</w:t>
       </w:r>
     </w:p>
     <w:p>
@@ -28,12 +34,23 @@
         <w:pStyle w:val="Heading1"/>
       </w:pPr>
       <w:r>
-        <w:t>What it does</w:t>
+        <w:t>What Pdf-Mithra does</w:t>
       </w:r>
     </w:p>
     <w:p>
       <w:r>
-        <w:t>Drop any PDF onto the app window and it extracts every highlight, underline, comment, and sticky note. Annotations appear as colour-coded cards, grouped by the section of the paper they came from. You can search, filter, label highlight colours, and export in multiple formats.</w:t>
+        <w:t>Pdf-Mithra is a free desktop app for Mac and Windows that turns your PDF annotations into structured, exportable notes — instantly.</w:t>
+        <w:br/>
+        <w:br/>
+        <w:t>Drop any annotated PDF onto the app and it extracts every highlight, underline, comment, and sticky note. Each annotation appears as a colour-coded card, automatically grouped by the section of the document it came from (Introduction, Methods, Results, etc.). You can search, filter, label colours with custom meanings, and export everything in the format that fits your workflow.</w:t>
+      </w:r>
+    </w:p>
+    <w:p>
+      <w:pPr>
+        <w:pStyle w:val="Heading1"/>
+      </w:pPr>
+      <w:r>
+        <w:t>Key features</w:t>
       </w:r>
     </w:p>
     <w:p>
@@ -41,7 +58,25 @@
         <w:pStyle w:val="Heading2"/>
       </w:pPr>
       <w:r>
-        <w:t>Export formats</w:t>
+        <w:t>Automatic section detection</w:t>
+      </w:r>
+    </w:p>
+    <w:p>
+      <w:r>
+        <w:t>Pdf-Mithra reads the structure of your PDF and groups annotations under the correct section heading — no manual tagging needed. Works with academic papers, books, and reports.</w:t>
+      </w:r>
+    </w:p>
+    <w:p>
+      <w:pPr>
+        <w:pStyle w:val="Heading2"/>
+      </w:pPr>
+      <w:r>
+        <w:t>Colour meaning system</w:t>
+      </w:r>
+    </w:p>
+    <w:p>
+      <w:r>
+        <w:t>Label what each highlight colour means to you. Apply a built-in preset in one click:</w:t>
       </w:r>
     </w:p>
     <w:p>
@@ -49,7 +84,7 @@
         <w:pStyle w:val="ListBullet"/>
       </w:pPr>
       <w:r>
-        <w:t>Standard Markdown</w:t>
+        <w:t>Academic Reading — Yellow: Key Argument, Green: Evidence, Red: Critique, Blue: Definition…</w:t>
       </w:r>
     </w:p>
     <w:p>
@@ -57,7 +92,7 @@
         <w:pStyle w:val="ListBullet"/>
       </w:pPr>
       <w:r>
-        <w:t>Markdown with document metadata header</w:t>
+        <w:t>Book Notes — Yellow: Main Idea, Green: Example, Red: Disagree…</w:t>
       </w:r>
     </w:p>
     <w:p>
@@ -65,7 +100,20 @@
         <w:pStyle w:val="ListBullet"/>
       </w:pPr>
       <w:r>
-        <w:t>Obsidian callout blocks</w:t>
+        <w:t>Code Review — Yellow: Question, Green: Good Pattern, Red: Bug / Issue…</w:t>
+      </w:r>
+    </w:p>
+    <w:p>
+      <w:r>
+        <w:t>Or define your own labels and save them for every future PDF.</w:t>
+      </w:r>
+    </w:p>
+    <w:p>
+      <w:pPr>
+        <w:pStyle w:val="Heading2"/>
+      </w:pPr>
+      <w:r>
+        <w:t>Six export formats</w:t>
       </w:r>
     </w:p>
     <w:p>
@@ -73,7 +121,7 @@
         <w:pStyle w:val="ListBullet"/>
       </w:pPr>
       <w:r>
-        <w:t>Markdown table (pipe format)</w:t>
+        <w:t>Standard Markdown — clean, portable notes</w:t>
       </w:r>
     </w:p>
     <w:p>
@@ -81,7 +129,7 @@
         <w:pStyle w:val="ListBullet"/>
       </w:pPr>
       <w:r>
-        <w:t>CSV — for Excel, Notion, Airtable</w:t>
+        <w:t>Markdown + Metadata — includes title, author, page count, word coverage</w:t>
       </w:r>
     </w:p>
     <w:p>
@@ -89,7 +137,70 @@
         <w:pStyle w:val="ListBullet"/>
       </w:pPr>
       <w:r>
-        <w:t>HTML report — self-contained, shareable, with search and colour filters</w:t>
+        <w:t>Obsidian Callout Blocks — ready to paste into your Obsidian vault</w:t>
+      </w:r>
+    </w:p>
+    <w:p>
+      <w:pPr>
+        <w:pStyle w:val="ListBullet"/>
+      </w:pPr>
+      <w:r>
+        <w:t>Markdown Table — pipe-table format for any Markdown workflow</w:t>
+      </w:r>
+    </w:p>
+    <w:p>
+      <w:pPr>
+        <w:pStyle w:val="ListBullet"/>
+      </w:pPr>
+      <w:r>
+        <w:t>CSV — open in Excel, Notion, Airtable, or any spreadsheet tool</w:t>
+      </w:r>
+    </w:p>
+    <w:p>
+      <w:pPr>
+        <w:pStyle w:val="ListBullet"/>
+      </w:pPr>
+      <w:r>
+        <w:t>HTML Report — self-contained file with search bar, colour filters, and print mode; shareable by email or link</w:t>
+      </w:r>
+    </w:p>
+    <w:p>
+      <w:pPr>
+        <w:pStyle w:val="Heading2"/>
+      </w:pPr>
+      <w:r>
+        <w:t>Batch mode</w:t>
+      </w:r>
+    </w:p>
+    <w:p>
+      <w:r>
+        <w:t>Drop multiple PDFs at once. Pdf-Mithra processes all of them and lets you export everything as a single combined file — perfect for literature reviews.</w:t>
+      </w:r>
+    </w:p>
+    <w:p>
+      <w:pPr>
+        <w:pStyle w:val="Heading2"/>
+      </w:pPr>
+      <w:r>
+        <w:t>Search and filter</w:t>
+      </w:r>
+    </w:p>
+    <w:p>
+      <w:r>
+        <w:t>Filter annotations by colour, annotation type, or document section. Full-text search works across highlighted text, section names, and colour meanings.</w:t>
+      </w:r>
+    </w:p>
+    <w:p>
+      <w:pPr>
+        <w:pStyle w:val="Heading2"/>
+      </w:pPr>
+      <w:r>
+        <w:t>Click to open at page (Mac)</w:t>
+      </w:r>
+    </w:p>
+    <w:p>
+      <w:r>
+        <w:t>On Mac, click any annotation card to jump directly to that page in Preview.</w:t>
       </w:r>
     </w:p>
     <w:p>
@@ -97,7 +208,20 @@
         <w:pStyle w:val="Heading1"/>
       </w:pPr>
       <w:r>
-        <w:t>Requirements</w:t>
+        <w:t>Available on Mac and Windows</w:t>
+      </w:r>
+    </w:p>
+    <w:p>
+      <w:r>
+        <w:t>Pdf-Mithra runs on both macOS and Windows with the same features. The launcher is different on each platform, but the app itself is identical.</w:t>
+      </w:r>
+    </w:p>
+    <w:p>
+      <w:pPr>
+        <w:pStyle w:val="Heading2"/>
+      </w:pPr>
+      <w:r>
+        <w:t>Mac</w:t>
       </w:r>
     </w:p>
     <w:p>
@@ -105,7 +229,7 @@
         <w:pStyle w:val="ListBullet"/>
       </w:pPr>
       <w:r>
-        <w:t>macOS 12 or later   (Windows version coming soon)</w:t>
+        <w:t>macOS 12 (Monterey) or later</w:t>
       </w:r>
     </w:p>
     <w:p>
@@ -113,7 +237,47 @@
         <w:pStyle w:val="ListBullet"/>
       </w:pPr>
       <w:r>
-        <w:t>Python 3.11 or later — download free from python.org/downloads</w:t>
+        <w:t>Python 3.11 or later from python.org/downloads</w:t>
+      </w:r>
+    </w:p>
+    <w:p>
+      <w:pPr>
+        <w:pStyle w:val="ListBullet"/>
+      </w:pPr>
+      <w:r>
+        <w:t>Keep the Pdf-Mithra folder in your home directory (not Desktop or Documents)</w:t>
+      </w:r>
+    </w:p>
+    <w:p>
+      <w:pPr>
+        <w:pStyle w:val="Heading2"/>
+      </w:pPr>
+      <w:r>
+        <w:t>Windows</w:t>
+      </w:r>
+    </w:p>
+    <w:p>
+      <w:pPr>
+        <w:pStyle w:val="ListBullet"/>
+      </w:pPr>
+      <w:r>
+        <w:t>Windows 10 or later</w:t>
+      </w:r>
+    </w:p>
+    <w:p>
+      <w:pPr>
+        <w:pStyle w:val="ListBullet"/>
+      </w:pPr>
+      <w:r>
+        <w:t>Python 3.11 or later from python.org/downloads</w:t>
+      </w:r>
+    </w:p>
+    <w:p>
+      <w:pPr>
+        <w:pStyle w:val="ListBullet"/>
+      </w:pPr>
+      <w:r>
+        <w:t>Tick "Add Python to PATH" during installation</w:t>
       </w:r>
     </w:p>
     <w:p>
@@ -121,26 +285,32 @@
         <w:pStyle w:val="Heading1"/>
       </w:pPr>
       <w:r>
-        <w:t>First-time setup  (Terminal, once only)</w:t>
+        <w:t>First-time setup — Mac</w:t>
       </w:r>
     </w:p>
     <w:p>
       <w:r>
-        <w:t>After this setup, the app opens with a double-click — you never need Terminal again.</w:t>
+        <w:t>You only do this once. After setup, just double-click to open the app.</w:t>
       </w:r>
     </w:p>
     <w:p>
       <w:r>
-        <w:t>Step 1 — Download the project folder</w:t>
+        <w:rPr>
+          <w:b/>
+        </w:rPr>
+        <w:t>Step 1 — Download</w:t>
       </w:r>
     </w:p>
     <w:p>
       <w:r>
-        <w:t>Save the entire Pdf-Mithra folder anywhere on your Mac (not in Desktop or Documents). Your home folder works great. Keep all the files together — the app needs them.</w:t>
+        <w:t>Download the Pdf-Mithra folder from github.com/drkbhere/pdf-mithra. Save it somewhere in your home folder (e.g. ~/Pdf-Mithra). Do not put it in Desktop or Documents.</w:t>
       </w:r>
     </w:p>
     <w:p>
       <w:r>
+        <w:rPr>
+          <w:b/>
+        </w:rPr>
         <w:t>Step 2 — Open Terminal</w:t>
       </w:r>
     </w:p>
@@ -151,22 +321,28 @@
     </w:p>
     <w:p>
       <w:r>
+        <w:rPr>
+          <w:b/>
+        </w:rPr>
         <w:t>Step 3 — Navigate to the folder</w:t>
       </w:r>
     </w:p>
     <w:p>
       <w:r>
-        <w:t>Type  cd  and a space, then drag the Pdf-Mithra folder into the Terminal window (the path fills in automatically). Press Return.</w:t>
+        <w:t>Type  cd  and a space, then drag the Pdf-Mithra folder into Terminal. Press Return.</w:t>
       </w:r>
     </w:p>
     <w:p>
       <w:r>
-        <w:t>Step 4 — Install dependencies  (once only)</w:t>
+        <w:rPr>
+          <w:b/>
+        </w:rPr>
+        <w:t>Step 4 — Install dependencies (once only)</w:t>
       </w:r>
     </w:p>
     <w:p>
       <w:r>
-        <w:t>Paste this and press Return:</w:t>
+        <w:t>Paste the line below and press Return:</w:t>
       </w:r>
     </w:p>
     <w:p>
@@ -184,7 +360,20 @@
     </w:p>
     <w:p>
       <w:r>
-        <w:t>Takes about a minute. Never needed again after this.</w:t>
+        <w:t>Takes about a minute.</w:t>
+      </w:r>
+    </w:p>
+    <w:p>
+      <w:r>
+        <w:rPr>
+          <w:b/>
+        </w:rPr>
+        <w:t>Step 5 — Launch</w:t>
+      </w:r>
+    </w:p>
+    <w:p>
+      <w:r>
+        <w:t>Double-click Pdf-Mithra.app. If macOS shows a security warning, right-click the app → Open → Open.</w:t>
       </w:r>
     </w:p>
     <w:p>
@@ -192,36 +381,51 @@
         <w:pStyle w:val="Heading1"/>
       </w:pPr>
       <w:r>
-        <w:t>Launching the app  (every time)</w:t>
+        <w:t>First-time setup — Windows</w:t>
       </w:r>
     </w:p>
     <w:p>
       <w:r>
-        <w:t xml:space="preserve">Double-click  </w:t>
+        <w:t>Even simpler than Mac. The batch file does the setup automatically.</w:t>
       </w:r>
+    </w:p>
+    <w:p>
       <w:r>
         <w:rPr>
           <w:b/>
         </w:rPr>
-        <w:t>Pdf-Mithra.app</w:t>
-      </w:r>
-      <w:r>
-        <w:t xml:space="preserve">  inside the project folder.</w:t>
-        <w:br/>
-        <w:t>The app opens directly — no Terminal, no typing. If macOS shows a security warning the first time, right-click the app → Open → Open.</w:t>
-      </w:r>
-    </w:p>
-    <w:p>
-      <w:pPr>
-        <w:pStyle w:val="Heading2"/>
-      </w:pPr>
-      <w:r>
-        <w:t>Important: keep the folder outside Desktop/Documents</w:t>
+        <w:t>Step 1 — Install Python</w:t>
       </w:r>
     </w:p>
     <w:p>
       <w:r>
-        <w:t>macOS restricts access to the Desktop and Documents folders for security. Keep the Pdf-Mithra folder in your home directory (e.g. /Users/yourname/Pdf-Mithra/) for the app to work correctly.</w:t>
+        <w:t>Download Python 3.11 or later from python.org/downloads. During installation, tick "Add Python to PATH" — this is important.</w:t>
+      </w:r>
+    </w:p>
+    <w:p>
+      <w:r>
+        <w:rPr>
+          <w:b/>
+        </w:rPr>
+        <w:t>Step 2 — Download</w:t>
+      </w:r>
+    </w:p>
+    <w:p>
+      <w:r>
+        <w:t>Download the Pdf-Mithra folder from github.com/drkbhere/pdf-mithra.</w:t>
+      </w:r>
+    </w:p>
+    <w:p>
+      <w:r>
+        <w:rPr>
+          <w:b/>
+        </w:rPr>
+        <w:t>Step 3 — Launch</w:t>
+      </w:r>
+    </w:p>
+    <w:p>
+      <w:r>
+        <w:t>Double-click Pdf-Mithra.bat. On first run it installs all dependencies automatically (takes about a minute). After that, every double-click just opens the app.</w:t>
       </w:r>
     </w:p>
     <w:p>
@@ -237,7 +441,7 @@
         <w:pStyle w:val="ListBullet"/>
       </w:pPr>
       <w:r>
-        <w:t>Drag and drop one or more PDFs onto the drop zone, or click Open PDF.</w:t>
+        <w:t>Drag and drop one or more PDFs onto the drop zone — or click Open PDF to browse.</w:t>
       </w:r>
     </w:p>
     <w:p>
@@ -245,7 +449,7 @@
         <w:pStyle w:val="ListBullet"/>
       </w:pPr>
       <w:r>
-        <w:t>Annotations appear as cards grouped by colour. Click any card to jump to that page in Preview.</w:t>
+        <w:t>Annotations appear as colour-coded cards, grouped by section.</w:t>
       </w:r>
     </w:p>
     <w:p>
@@ -253,7 +457,7 @@
         <w:pStyle w:val="ListBullet"/>
       </w:pPr>
       <w:r>
-        <w:t>Use the Filter bar to narrow by colour, annotation type, or document section.</w:t>
+        <w:t>Use the Filter bar to narrow by colour, type, or section. Use Search for text.</w:t>
       </w:r>
     </w:p>
     <w:p>
@@ -261,7 +465,15 @@
         <w:pStyle w:val="ListBullet"/>
       </w:pPr>
       <w:r>
-        <w:t>Use the Format dropdown to pick your export format.</w:t>
+        <w:t>Click Color Meanings… to label your highlight colours (or apply a preset).</w:t>
+      </w:r>
+    </w:p>
+    <w:p>
+      <w:pPr>
+        <w:pStyle w:val="ListBullet"/>
+      </w:pPr>
+      <w:r>
+        <w:t>Choose a format from the Format dropdown.</w:t>
       </w:r>
     </w:p>
     <w:p>
@@ -277,38 +489,18 @@
         <w:pStyle w:val="ListBullet"/>
       </w:pPr>
       <w:r>
-        <w:t>Click Color Meanings… to label what each highlight colour means to you (e.g. apply the 'Academic Reading' preset: Yellow = Key Argument, Red = Critique, etc.).</w:t>
+        <w:t>On Mac: click any annotation card to jump to that page in Preview.</w:t>
       </w:r>
     </w:p>
-    <w:p>
-      <w:pPr>
-        <w:pStyle w:val="Heading2"/>
-      </w:pPr>
-      <w:r>
-        <w:t>Tip — Batch mode</w:t>
-      </w:r>
-    </w:p>
+    <w:p/>
     <w:p>
       <w:r>
-        <w:t>Drop multiple PDFs at once. The app extracts annotations from all of them and lets you export everything as a single CSV or HTML report — great for literature reviews.</w:t>
-      </w:r>
-    </w:p>
-    <w:p>
-      <w:pPr>
-        <w:pStyle w:val="Heading1"/>
-      </w:pPr>
-      <w:r>
-        <w:t>Windows version</w:t>
-      </w:r>
-    </w:p>
-    <w:p>
-      <w:r>
-        <w:t>The current version is Mac-only. A Windows version is being worked on. If you need it urgently, get in touch.</w:t>
-      </w:r>
-    </w:p>
-    <w:p>
-      <w:r>
+        <w:rPr>
+          <w:i/>
+        </w:rPr>
         <w:t>Free to use. Always.</w:t>
+        <w:br/>
+        <w:t>github.com/drkbhere/pdf-mithra</w:t>
       </w:r>
     </w:p>
     <w:sectPr>

</xml_diff>

<commit_message>
Remove name origin story from README and user guide
Co-Authored-By: Claude Sonnet 4.6 <noreply@anthropic.com>
</commit_message>
<xml_diff>
--- a/How to use Pdf-Mithra.docx
+++ b/How to use Pdf-Mithra.docx
@@ -16,17 +16,6 @@
     <w:p>
       <w:r>
         <w:t>Your friendly companion for PDF highlights.</w:t>
-      </w:r>
-    </w:p>
-    <w:p>
-      <w:r>
-        <w:rPr>
-          <w:i/>
-        </w:rPr>
-        <w:t>Named after Sangha Mithra</w:t>
-      </w:r>
-      <w:r>
-        <w:t xml:space="preserve"> — Mithra means friend, and Pdf-Mithra is your friend of PDFs.</w:t>
       </w:r>
     </w:p>
     <w:p>

</xml_diff>

<commit_message>
Add screenshots to README and user guide
- screenshots/empty.png: app on launch (empty state)
- screenshots/loaded.png: app with annotations loaded, grouped by section
- README.md: hero screenshot below tagline + side-by-side screenshots table
- How to use Pdf-Mithra.docx: screenshots added next to relevant sections

Co-Authored-By: Claude Sonnet 4.6 <noreply@anthropic.com>
</commit_message>
<xml_diff>
--- a/How to use Pdf-Mithra.docx
+++ b/How to use Pdf-Mithra.docx
@@ -32,6 +32,58 @@
         <w:br/>
         <w:br/>
         <w:t>Drop any annotated PDF onto the app and it extracts every highlight, underline, comment, and sticky note. Each annotation appears as a colour-coded card, automatically grouped by the section of the document it came from (Introduction, Methods, Results, etc.). You can search, filter, label colours with custom meanings, and export everything in the format that fits your workflow.</w:t>
+      </w:r>
+    </w:p>
+    <w:p>
+      <w:pPr>
+        <w:jc w:val="center"/>
+      </w:pPr>
+      <w:r>
+        <w:drawing>
+          <wp:inline xmlns:a="http://schemas.openxmlformats.org/drawingml/2006/main" xmlns:pic="http://schemas.openxmlformats.org/drawingml/2006/picture">
+            <wp:extent cx="5029200" cy="4561367"/>
+            <wp:docPr id="1" name="Picture 1"/>
+            <wp:cNvGraphicFramePr>
+              <a:graphicFrameLocks noChangeAspect="1"/>
+            </wp:cNvGraphicFramePr>
+            <a:graphic>
+              <a:graphicData uri="http://schemas.openxmlformats.org/drawingml/2006/picture">
+                <pic:pic>
+                  <pic:nvPicPr>
+                    <pic:cNvPr id="0" name="loaded.png"/>
+                    <pic:cNvPicPr/>
+                  </pic:nvPicPr>
+                  <pic:blipFill>
+                    <a:blip r:embed="rId9"/>
+                    <a:stretch>
+                      <a:fillRect/>
+                    </a:stretch>
+                  </pic:blipFill>
+                  <pic:spPr>
+                    <a:xfrm>
+                      <a:off x="0" y="0"/>
+                      <a:ext cx="5029200" cy="4561367"/>
+                    </a:xfrm>
+                    <a:prstGeom prst="rect"/>
+                  </pic:spPr>
+                </pic:pic>
+              </a:graphicData>
+            </a:graphic>
+          </wp:inline>
+        </w:drawing>
+      </w:r>
+    </w:p>
+    <w:p>
+      <w:pPr>
+        <w:jc w:val="center"/>
+      </w:pPr>
+      <w:r>
+        <w:rPr>
+          <w:i/>
+          <w:color w:val="6B6560"/>
+          <w:sz w:val="18"/>
+        </w:rPr>
+        <w:t>Pdf-Mithra — annotations extracted and grouped by section</w:t>
       </w:r>
     </w:p>
     <w:p>

</xml_diff>